<commit_message>
docs: BC tiếp thu bỏ cụm ý kiến chỉ đạo ngày 12/10 (tác nghiệp thường xuyên); cập nhật báo cáo rà soát 897
Co-Authored-By: Claude Opus 5.5 <noreply@anthropic.com>
</commit_message>
<xml_diff>
--- a/30-Ket-Qua/2026-10-12/Ra-Soat/BAO-CAO-RA-SOAT-897-v2.25_Ho-so-tiep-thu-tham-dinh-lan-2-KTC-Quan-tri_20261012.docx
+++ b/30-Ket-Qua/2026-10-12/Ra-Soat/BAO-CAO-RA-SOAT-897-v2.25_Ho-so-tiep-thu-tham-dinh-lan-2-KTC-Quan-tri_20261012.docx
@@ -664,7 +664,7 @@
                 <w:i w:val="0"/>
                 <w:sz w:val="26"/>
               </w:rPr>
-              <w:t>0 vấn đề Mức 1; 01 Mức 2 và 01 Mức 3 đã sửa bằng Track Changes ngay trong lần rà soát, 01 Mức 4 đã sửa; 03 Mức 4 để người soạn thảo xem xét</w:t>
+              <w:t>0 vấn đề Mức 1; 01 Mức 2 và 01 Mức 3 đã sửa bằng Track Changes ngay trong lần rà soát, 01 Mức 4 đã sửa; 01 Mức 4 đã xử lý theo ý kiến người soạn thảo; 02 Mức 4 để người soạn thảo xem xét</w:t>
             </w:r>
           </w:p>
         </w:tc>
@@ -1672,185 +1672,6 @@
                 <w:i w:val="0"/>
                 <w:sz w:val="26"/>
               </w:rPr>
-              <w:t>Báo cáo tiếp thu, đoạn mở đầu</w:t>
-            </w:r>
-          </w:p>
-        </w:tc>
-        <w:tc>
-          <w:tcPr>
-            <w:tcW w:type="dxa" w:w="2428"/>
-            <w:tcMar>
-              <w:top w:w="60" w:type="dxa"/>
-              <w:start w:w="90" w:type="dxa"/>
-              <w:bottom w:w="60" w:type="dxa"/>
-              <w:end w:w="90" w:type="dxa"/>
-            </w:tcMar>
-            <w:vAlign w:val="top"/>
-          </w:tcPr>
-          <w:p>
-            <w:pPr>
-              <w:spacing w:after="0" w:line="240" w:lineRule="auto"/>
-              <w:ind w:firstLine="0" w:left="0"/>
-              <w:jc w:val="both"/>
-            </w:pPr>
-            <w:r/>
-            <w:r>
-              <w:rPr>
-                <w:rFonts w:ascii="Times New Roman" w:hAnsi="Times New Roman"/>
-                <w:b w:val="0"/>
-                <w:i w:val="0"/>
-                <w:sz w:val="26"/>
-              </w:rPr>
-              <w:t>“Ý kiến chỉ đạo của Hiệu trưởng ngày 12/10/2026” chưa ghi hình thức chỉ đạo</w:t>
-            </w:r>
-          </w:p>
-        </w:tc>
-        <w:tc>
-          <w:tcPr>
-            <w:tcW w:type="dxa" w:w="2428"/>
-            <w:tcMar>
-              <w:top w:w="60" w:type="dxa"/>
-              <w:start w:w="90" w:type="dxa"/>
-              <w:bottom w:w="60" w:type="dxa"/>
-              <w:end w:w="90" w:type="dxa"/>
-            </w:tcMar>
-            <w:vAlign w:val="top"/>
-          </w:tcPr>
-          <w:p>
-            <w:pPr>
-              <w:spacing w:after="0" w:line="240" w:lineRule="auto"/>
-              <w:ind w:firstLine="0" w:left="0"/>
-              <w:jc w:val="both"/>
-            </w:pPr>
-            <w:r/>
-            <w:r>
-              <w:rPr>
-                <w:rFonts w:ascii="Times New Roman" w:hAnsi="Times New Roman"/>
-                <w:b w:val="0"/>
-                <w:i w:val="0"/>
-                <w:sz w:val="26"/>
-              </w:rPr>
-              <w:t>Người soạn thảo cân nhắc ghi hình thức (ví dụ: Ý kiến trao đổi trực tiếp)</w:t>
-            </w:r>
-          </w:p>
-        </w:tc>
-        <w:tc>
-          <w:tcPr>
-            <w:tcW w:type="dxa" w:w="2428"/>
-            <w:tcMar>
-              <w:top w:w="60" w:type="dxa"/>
-              <w:start w:w="90" w:type="dxa"/>
-              <w:bottom w:w="60" w:type="dxa"/>
-              <w:end w:w="90" w:type="dxa"/>
-            </w:tcMar>
-            <w:vAlign w:val="top"/>
-          </w:tcPr>
-          <w:p>
-            <w:pPr>
-              <w:spacing w:after="0" w:line="240" w:lineRule="auto"/>
-              <w:ind w:firstLine="0" w:left="0"/>
-              <w:jc w:val="both"/>
-            </w:pPr>
-            <w:r/>
-            <w:r>
-              <w:rPr>
-                <w:rFonts w:ascii="Times New Roman" w:hAnsi="Times New Roman"/>
-                <w:b w:val="0"/>
-                <w:i w:val="0"/>
-                <w:sz w:val="26"/>
-              </w:rPr>
-              <w:t>Checklist 02 (nguồn kiểm chứng được)</w:t>
-            </w:r>
-          </w:p>
-        </w:tc>
-        <w:tc>
-          <w:tcPr>
-            <w:tcW w:type="dxa" w:w="2428"/>
-            <w:tcMar>
-              <w:top w:w="60" w:type="dxa"/>
-              <w:start w:w="90" w:type="dxa"/>
-              <w:bottom w:w="60" w:type="dxa"/>
-              <w:end w:w="90" w:type="dxa"/>
-            </w:tcMar>
-            <w:vAlign w:val="top"/>
-          </w:tcPr>
-          <w:p>
-            <w:pPr>
-              <w:spacing w:after="0" w:line="240" w:lineRule="auto"/>
-              <w:ind w:firstLine="0" w:left="0"/>
-              <w:jc w:val="center"/>
-            </w:pPr>
-            <w:r/>
-            <w:r>
-              <w:rPr>
-                <w:rFonts w:ascii="Times New Roman" w:hAnsi="Times New Roman"/>
-                <w:b w:val="0"/>
-                <w:i w:val="0"/>
-                <w:sz w:val="26"/>
-              </w:rPr>
-              <w:t>Mức 4</w:t>
-            </w:r>
-          </w:p>
-        </w:tc>
-      </w:tr>
-      <w:tr>
-        <w:trPr>
-          <w:cantSplit w:val="0"/>
-        </w:trPr>
-        <w:tc>
-          <w:tcPr>
-            <w:tcW w:type="dxa" w:w="2428"/>
-            <w:tcMar>
-              <w:top w:w="60" w:type="dxa"/>
-              <w:start w:w="90" w:type="dxa"/>
-              <w:bottom w:w="60" w:type="dxa"/>
-              <w:end w:w="90" w:type="dxa"/>
-            </w:tcMar>
-            <w:vAlign w:val="top"/>
-          </w:tcPr>
-          <w:p>
-            <w:pPr>
-              <w:spacing w:after="0" w:line="240" w:lineRule="auto"/>
-              <w:ind w:firstLine="0" w:left="0"/>
-              <w:jc w:val="center"/>
-            </w:pPr>
-            <w:r/>
-            <w:r>
-              <w:rPr>
-                <w:rFonts w:ascii="Times New Roman" w:hAnsi="Times New Roman"/>
-                <w:b w:val="0"/>
-                <w:i w:val="0"/>
-                <w:sz w:val="26"/>
-              </w:rPr>
-              <w:t>6</w:t>
-            </w:r>
-          </w:p>
-        </w:tc>
-        <w:tc>
-          <w:tcPr>
-            <w:tcW w:type="dxa" w:w="2428"/>
-            <w:tcMar>
-              <w:top w:w="60" w:type="dxa"/>
-              <w:start w:w="90" w:type="dxa"/>
-              <w:bottom w:w="60" w:type="dxa"/>
-              <w:end w:w="90" w:type="dxa"/>
-            </w:tcMar>
-            <w:vAlign w:val="top"/>
-          </w:tcPr>
-          <w:p>
-            <w:pPr>
-              <w:spacing w:after="0" w:line="240" w:lineRule="auto"/>
-              <w:ind w:firstLine="0" w:left="0"/>
-              <w:jc w:val="both"/>
-            </w:pPr>
-            <w:r/>
-            <w:r>
-              <w:rPr>
-                <w:rFonts w:ascii="Times New Roman" w:hAnsi="Times New Roman"/>
-                <w:b w:val="0"/>
-                <w:i w:val="0"/>
-                <w:sz w:val="26"/>
-              </w:rPr>
               <w:t>Thông báo, Lưu ý cuối Mục 3 Phần I</w:t>
             </w:r>
           </w:p>
@@ -2470,7 +2291,7 @@
                 <w:i w:val="0"/>
                 <w:sz w:val="26"/>
               </w:rPr>
-              <w:t>Còn 02 Mức 4</w:t>
+              <w:t>Còn 01 Mức 4 (giữ nguyên)</w:t>
             </w:r>
           </w:p>
         </w:tc>
@@ -2852,6 +2673,22 @@
           <w:i w:val="0"/>
           <w:sz w:val="28"/>
         </w:rPr>
+        <w:t>Báo cáo tiếp thu, đoạn mở đầu: Bỏ cụm “ý kiến chỉ đạo của Hiệu trưởng ngày 12/10/2026” (tác nghiệp thường xuyên), mở đầu bằng việc nhận Báo cáo thẩm định lần 2 — đã xử lý theo ý kiến người soạn thảo.</w:t>
+      </w:r>
+    </w:p>
+    <w:p>
+      <w:pPr>
+        <w:spacing w:after="60" w:line="276" w:lineRule="auto"/>
+        <w:ind w:firstLine="567"/>
+        <w:jc w:val="both"/>
+      </w:pPr>
+      <w:r>
+        <w:rPr>
+          <w:rFonts w:ascii="Times New Roman" w:hAnsi="Times New Roman"/>
+          <w:b w:val="0"/>
+          <w:i w:val="0"/>
+          <w:sz w:val="28"/>
+        </w:rPr>
         <w:t>Ghi chú: Vấn đề số 1 (Mức 2) chung cho Thông báo và Tài liệu hướng dẫn nên được đếm ở từng văn bản.</w:t>
       </w:r>
     </w:p>
@@ -2961,7 +2798,7 @@
           <w:i w:val="0"/>
           <w:sz w:val="28"/>
         </w:rPr>
-        <w:t>Thứ tự xử lý: (1) Người soạn thảo xem xét 03 vấn đề Mức 4 còn lại (số 4, 5, 6); (2) Ký Báo cáo tiếp thu, giải trình; (3) Trình Hiệu trưởng ký ban hành Thông báo bản 10 kèm Tài liệu hướng dẫn bản 10; (4) Công bố tệp plugin 1.3.13 kèm mã SHA-256 và ghi chú phát hành.</w:t>
+        <w:t>Thứ tự xử lý: (1) Người soạn thảo xem xét 02 vấn đề Mức 4 còn lại (số 4, 5); (2) Ký Báo cáo tiếp thu, giải trình; (3) Trình Hiệu trưởng ký ban hành Thông báo bản 10 kèm Tài liệu hướng dẫn bản 10; (4) Công bố tệp plugin 1.3.13 kèm mã SHA-256 và ghi chú phát hành.</w:t>
       </w:r>
     </w:p>
     <w:p>

</xml_diff>